<commit_message>
build(p6): rebuild blinded manuscript .docx for MRQ from updated markdown
Adds scripts/build_p6_blinded_docx.sh: blinds the master markdown (removes the author
block, anonymises the in-text PI mention to 'the first author') with a leak-check guard,
then renders via pandoc + templates/ctu_paper_reference.docx (same styling as the P3/P4/P5
submission build), embedding Figures 1-5 from p6/figures/. Rebuilt
mrq_package/01_manuscript_blinded.docx (1.4 MB, 5 figures): verified MRQ target present,
key numbers intact (r=.074, Q_M=17.35, I2=62.4%), no author-identifying tokens, and 'Can
Tho University' absent from the body. README rebuild status updated; title page + cover
letter still need manual IBR->MRQ retarget (no markdown source).

https://claude.ai/code/session_01TNqoRFY1vAVQL6GWg8X9M3
</commit_message>
<xml_diff>
--- a/p6/submission/mrq_package/01_manuscript_blinded.docx
+++ b/p6/submission/mrq_package/01_manuscript_blinded.docx
@@ -17,44 +17,10 @@
       </w:pPr>
       <w:r>
         <w:rPr>
-          <w:bCs/>
-          <w:b/>
-        </w:rPr>
-        <w:t xml:space="preserve">Đỗ Thị Thúy Hương</w:t>
-      </w:r>
-      <w:r>
-        <w:t xml:space="preserve"> </w:t>
-      </w:r>
-      <w:r>
-        <w:t xml:space="preserve">· Can Tho University / Huong Do Thi Thuy</w:t>
-      </w:r>
-      <w:r>
-        <w:t xml:space="preserve"> </w:t>
-      </w:r>
-      <w:r>
-        <w:rPr>
-          <w:bCs/>
-          <w:b/>
-        </w:rPr>
-        <w:t xml:space="preserve">Phan Anh Tú</w:t>
-      </w:r>
-      <w:r>
-        <w:t xml:space="preserve"> </w:t>
-      </w:r>
-      <w:r>
-        <w:t xml:space="preserve">· Can Tho University</w:t>
-      </w:r>
-    </w:p>
-    <w:p>
-      <w:pPr>
-        <w:pStyle w:val="BodyText"/>
-      </w:pPr>
-      <w:r>
-        <w:rPr>
-          <w:iCs/>
-          <w:i/>
-        </w:rPr>
-        <w:t xml:space="preserve">Manuscript prepared for: International Business Review (IBR, Elsevier, IF ≈ 5.5, ABS-3)</w:t>
+          <w:iCs/>
+          <w:i/>
+        </w:rPr>
+        <w:t xml:space="preserve">Manuscript prepared for: Management Review Quarterly (Springer; Scopus Q1, systematic reviews &amp; meta-analyses)</w:t>
       </w:r>
       <w:r>
         <w:t xml:space="preserve"> </w:t>
@@ -88,7 +54,7 @@
         <w:pStyle w:val="FirstParagraph"/>
       </w:pPr>
       <w:r>
-        <w:t xml:space="preserve">This study reports the first three-level meta-analytic regression analysis (MARA) of the internationalization–performance (I-P) relationship to test whether country-level digital adoption (cDAI), institutional context regime (ICRV), and Digital Paradox Lifecycle (DPL) phase moderate it. Following PRISMA 2020, a systematic Web of Science and Scopus search (1977–2026) yields k = 238 studies and K = 288 effect sizes from 49 economies; three-level MARA decomposes within- and between-study heterogeneity using metafor, with OSF pre-registration and inter-coder reliability κ ≥ 0.70. The baseline pooled effect is r = 0.074 (95% CI [0.060, 0.088], p &lt; .001; I² = 62.4%). The hypothesized moderators show limited support: ICRV regime differences are significant (Q_M = 17.35, df = 4, p = .002) but reflect single- versus multi-country study composition rather than a monotone institutional gradient, while cDAI and DPL moderation are non-significant. The headline result is substantial publication bias: trim-and-fill imputes k = 58 missing studies, cutting the pooled effect to r = 0.035 (95% CI [0.023, 0.048]), an implied ~53% attenuation (Begg p &lt; .001; Egger p = .057). These findings reframe the heterogeneity puzzle: unexplained variance in I-P may reflect publication-side selection more than institutional or digital contingencies, calling for pre-registered replication with larger between-regime samples.</w:t>
+        <w:t xml:space="preserve">This study reports the first three-level meta-analytic regression analysis (MARA) of the internationalization–performance (I-P) relationship to test whether country-level digital adoption (cDAI), institutional context regime (ICRV), and Digital Paradox Lifecycle (DPL) phase moderate it. Following PRISMA 2020, a systematic Web of Science and Scopus search (1977–2026) yields k = 238 studies and K = 288 effect sizes from 49 economies; three-level MARA decomposes within- and between-study heterogeneity using metafor, with OSF pre-registration and inter-coder reliability κ ≥ 0.70. The baseline pooled effect is r = .074 (95% CI [.060, .088], p &lt; .001; I² = 62.4%). The hypothesized moderators show limited support: ICRV regime differences are significant (Q_M = 17.35, df = 4, p = .002) but reflect single- versus multi-country study composition rather than a monotone institutional gradient, while cDAI and DPL moderation are non-significant. The headline result is substantial publication bias: trim-and-fill imputes k = 58 missing studies, cutting the pooled effect to r = .035 (95% CI [.023, .048]), an implied ~53% attenuation (Begg p &lt; .001; Egger p = .057). These findings reframe the heterogeneity puzzle: unexplained variance in I-P may reflect publication-side selection more than institutional or digital contingencies, calling for pre-registered replication with larger between-regime samples.</w:t>
       </w:r>
     </w:p>
     <w:p>
@@ -1647,13 +1613,13 @@
           <w:iCs/>
           <w:i/>
         </w:rPr>
-        <w:t xml:space="preserve">International Business Review</w:t>
-      </w:r>
-      <w:r>
-        <w:t xml:space="preserve"> </w:t>
-      </w:r>
-      <w:r>
-        <w:t xml:space="preserve">(IBR, Elsevier, IF ≈ 5.5).</w:t>
+        <w:t xml:space="preserve">Management Review Quarterly</w:t>
+      </w:r>
+      <w:r>
+        <w:t xml:space="preserve"> </w:t>
+      </w:r>
+      <w:r>
+        <w:t xml:space="preserve">(Springer; Scopus Q1).</w:t>
       </w:r>
     </w:p>
     <w:p>
@@ -1899,6 +1865,24 @@
       </w:r>
       <w:r>
         <w:t xml:space="preserve">(DOI: 10.17605/OSF.IO/Z37KN; registered May 18, 2026).</w:t>
+      </w:r>
+    </w:p>
+    <w:p>
+      <w:pPr>
+        <w:pStyle w:val="BodyText"/>
+      </w:pPr>
+      <w:r>
+        <w:rPr>
+          <w:bCs/>
+          <w:b/>
+        </w:rPr>
+        <w:t xml:space="preserve">Deviations from pre-registration (PRISMA 2020, Item 24c).</w:t>
+      </w:r>
+      <w:r>
+        <w:t xml:space="preserve"> </w:t>
+      </w:r>
+      <w:r>
+        <w:t xml:space="preserve">Three operational refinements were made after registration and are disclosed here for transparency; none alters the registered hypotheses, the primary three-level model, or the analysis plan. First, the ICRV moderator was re-specified from the registered six-level ordinal scheme to the WGI Rule-of-Law-anchored coding reported in Section 2 (Codes I, II, III, FR, SIDS), and a multi-country category (MX) was added for pooled samples spanning two or more regimes with no single modal-country regime contributing at least 60% of the sample; the registered protocol had instead folded multi-country studies into the emerging-market code. Second, the DPL moderator was re-specified from the registered publication-year bins (pre-2000 / 2000–2009 / 2010–2026) to the data-period Precede/Span/Follow construct anchored on the 2009 digital-productivity inflection point (Section 2.3), which more directly operationalises the underlying J-curve logic. Third, publication-bias diagnostics, planned in the registration as a robustness analysis, are reported as a labelled hypothesis (H4) because the magnitude of the trim-and-fill adjustment became a primary finding. The extraction codebook accompanying the data (v1.1) documents the coding actually applied; the registered v1.0 scheme remains in the frozen OSF record.</w:t>
       </w:r>
     </w:p>
     <w:bookmarkEnd w:id="33"/>
@@ -3244,7 +3228,7 @@
         <w:pStyle w:val="FirstParagraph"/>
       </w:pPr>
       <w:r>
-        <w:t xml:space="preserve">Statistical parameters were extracted manually from the full text of each eligible study by the primary coder (PI: Đỗ Thùy Hương), using the standardized coding form specified in Appendix B. For each study, the following parameters were recorded: sample size (</w:t>
+        <w:t xml:space="preserve">Statistical parameters were extracted manually from the full text of each eligible study by the primary coder (by the first author), using the standardized coding form specified in Appendix B. For each study, the following parameters were recorded: sample size (</w:t>
       </w:r>
       <w:r>
         <w:rPr>
@@ -16023,7 +16007,7 @@
           <w:iCs/>
           <w:i/>
         </w:rPr>
-        <w:t xml:space="preserve">Target journal: International Business Review (IBR, Elsevier, IF ≈ 5.5, ABS-3). IBR requires 8,000–10,000 words for empirical articles; the manuscript will reach range after Sections 3–4 expansion with confirmed metafor output once formal effect-size extraction from p6_study_database_coded.md is complete using the standardized coding protocol (Appendix B).</w:t>
+        <w:t xml:space="preserve">Target journal: Management Review Quarterly (Springer; Scopus Q1), which specialises in systematic reviews and meta-analyses and accommodates comprehensive length. Analyses use the verified baseline corpus (k = 238 studies, K = 288 effect sizes); the formal WoS/Scopus search expansion is ongoing and will be incorporated at revision. Effect-size coding follows the standardized protocol (Appendix B).</w:t>
       </w:r>
     </w:p>
     <w:bookmarkEnd w:id="79"/>
@@ -17018,13 +17002,15 @@
     <w:link w:val="VerbatimChar"/>
     <w:pPr>
       <w:wordWrap w:val="off"/>
+      <w:shd w:val="clear" w:fill="f8f8f8"/>
     </w:pPr>
   </w:style>
   <w:style w:type="character" w:customStyle="1" w:styleId="KeywordTok">
     <w:name w:val="KeywordTok"/>
     <w:basedOn w:val="VerbatimChar"/>
     <w:rPr>
-      <w:color w:val="007020"/>
+      <w:color w:val="204a87"/>
+      <w:shd w:val="clear" w:fill="f8f8f8"/>
       <w:b/>
     </w:rPr>
   </w:style>
@@ -17032,85 +17018,96 @@
     <w:name w:val="DataTypeTok"/>
     <w:basedOn w:val="VerbatimChar"/>
     <w:rPr>
-      <w:color w:val="902000"/>
+      <w:color w:val="204a87"/>
+      <w:shd w:val="clear" w:fill="f8f8f8"/>
     </w:rPr>
   </w:style>
   <w:style w:type="character" w:customStyle="1" w:styleId="DecValTok">
     <w:name w:val="DecValTok"/>
     <w:basedOn w:val="VerbatimChar"/>
     <w:rPr>
-      <w:color w:val="40a070"/>
+      <w:color w:val="0000cf"/>
+      <w:shd w:val="clear" w:fill="f8f8f8"/>
     </w:rPr>
   </w:style>
   <w:style w:type="character" w:customStyle="1" w:styleId="BaseNTok">
     <w:name w:val="BaseNTok"/>
     <w:basedOn w:val="VerbatimChar"/>
     <w:rPr>
-      <w:color w:val="40a070"/>
+      <w:color w:val="0000cf"/>
+      <w:shd w:val="clear" w:fill="f8f8f8"/>
     </w:rPr>
   </w:style>
   <w:style w:type="character" w:customStyle="1" w:styleId="FloatTok">
     <w:name w:val="FloatTok"/>
     <w:basedOn w:val="VerbatimChar"/>
     <w:rPr>
-      <w:color w:val="40a070"/>
+      <w:color w:val="0000cf"/>
+      <w:shd w:val="clear" w:fill="f8f8f8"/>
     </w:rPr>
   </w:style>
   <w:style w:type="character" w:customStyle="1" w:styleId="ConstantTok">
     <w:name w:val="ConstantTok"/>
     <w:basedOn w:val="VerbatimChar"/>
     <w:rPr>
-      <w:color w:val="880000"/>
+      <w:color w:val="8f5902"/>
+      <w:shd w:val="clear" w:fill="f8f8f8"/>
     </w:rPr>
   </w:style>
   <w:style w:type="character" w:customStyle="1" w:styleId="CharTok">
     <w:name w:val="CharTok"/>
     <w:basedOn w:val="VerbatimChar"/>
     <w:rPr>
-      <w:color w:val="4070a0"/>
+      <w:color w:val="4e9a06"/>
+      <w:shd w:val="clear" w:fill="f8f8f8"/>
     </w:rPr>
   </w:style>
   <w:style w:type="character" w:customStyle="1" w:styleId="SpecialCharTok">
     <w:name w:val="SpecialCharTok"/>
     <w:basedOn w:val="VerbatimChar"/>
     <w:rPr>
-      <w:color w:val="4070a0"/>
+      <w:color w:val="ce5c00"/>
+      <w:shd w:val="clear" w:fill="f8f8f8"/>
+      <w:b/>
     </w:rPr>
   </w:style>
   <w:style w:type="character" w:customStyle="1" w:styleId="StringTok">
     <w:name w:val="StringTok"/>
     <w:basedOn w:val="VerbatimChar"/>
     <w:rPr>
-      <w:color w:val="4070a0"/>
+      <w:color w:val="4e9a06"/>
+      <w:shd w:val="clear" w:fill="f8f8f8"/>
     </w:rPr>
   </w:style>
   <w:style w:type="character" w:customStyle="1" w:styleId="VerbatimStringTok">
     <w:name w:val="VerbatimStringTok"/>
     <w:basedOn w:val="VerbatimChar"/>
     <w:rPr>
-      <w:color w:val="4070a0"/>
+      <w:color w:val="4e9a06"/>
+      <w:shd w:val="clear" w:fill="f8f8f8"/>
     </w:rPr>
   </w:style>
   <w:style w:type="character" w:customStyle="1" w:styleId="SpecialStringTok">
     <w:name w:val="SpecialStringTok"/>
     <w:basedOn w:val="VerbatimChar"/>
     <w:rPr>
-      <w:color w:val="bb6688"/>
+      <w:color w:val="4e9a06"/>
+      <w:shd w:val="clear" w:fill="f8f8f8"/>
     </w:rPr>
   </w:style>
   <w:style w:type="character" w:customStyle="1" w:styleId="ImportTok">
     <w:name w:val="ImportTok"/>
     <w:basedOn w:val="VerbatimChar"/>
     <w:rPr>
-      <w:color w:val="008000"/>
-      <w:b/>
+      <w:shd w:val="clear" w:fill="f8f8f8"/>
     </w:rPr>
   </w:style>
   <w:style w:type="character" w:customStyle="1" w:styleId="CommentTok">
     <w:name w:val="CommentTok"/>
     <w:basedOn w:val="VerbatimChar"/>
     <w:rPr>
-      <w:color w:val="60a0b0"/>
+      <w:color w:val="8f5902"/>
+      <w:shd w:val="clear" w:fill="f8f8f8"/>
       <w:i/>
     </w:rPr>
   </w:style>
@@ -17118,7 +17115,9 @@
     <w:name w:val="DocumentationTok"/>
     <w:basedOn w:val="VerbatimChar"/>
     <w:rPr>
-      <w:color w:val="ba2121"/>
+      <w:color w:val="8f5902"/>
+      <w:shd w:val="clear" w:fill="f8f8f8"/>
+      <w:b/>
       <w:i/>
     </w:rPr>
   </w:style>
@@ -17126,7 +17125,8 @@
     <w:name w:val="AnnotationTok"/>
     <w:basedOn w:val="VerbatimChar"/>
     <w:rPr>
-      <w:color w:val="60a0b0"/>
+      <w:color w:val="8f5902"/>
+      <w:shd w:val="clear" w:fill="f8f8f8"/>
       <w:b/>
       <w:i/>
     </w:rPr>
@@ -17135,7 +17135,8 @@
     <w:name w:val="CommentVarTok"/>
     <w:basedOn w:val="VerbatimChar"/>
     <w:rPr>
-      <w:color w:val="60a0b0"/>
+      <w:color w:val="8f5902"/>
+      <w:shd w:val="clear" w:fill="f8f8f8"/>
       <w:b/>
       <w:i/>
     </w:rPr>
@@ -17144,28 +17145,33 @@
     <w:name w:val="OtherTok"/>
     <w:basedOn w:val="VerbatimChar"/>
     <w:rPr>
-      <w:color w:val="007020"/>
+      <w:color w:val="8f5902"/>
+      <w:shd w:val="clear" w:fill="f8f8f8"/>
     </w:rPr>
   </w:style>
   <w:style w:type="character" w:customStyle="1" w:styleId="FunctionTok">
     <w:name w:val="FunctionTok"/>
     <w:basedOn w:val="VerbatimChar"/>
     <w:rPr>
-      <w:color w:val="06287e"/>
+      <w:color w:val="204a87"/>
+      <w:shd w:val="clear" w:fill="f8f8f8"/>
+      <w:b/>
     </w:rPr>
   </w:style>
   <w:style w:type="character" w:customStyle="1" w:styleId="VariableTok">
     <w:name w:val="VariableTok"/>
     <w:basedOn w:val="VerbatimChar"/>
     <w:rPr>
-      <w:color w:val="19177c"/>
+      <w:color w:val="000000"/>
+      <w:shd w:val="clear" w:fill="f8f8f8"/>
     </w:rPr>
   </w:style>
   <w:style w:type="character" w:customStyle="1" w:styleId="ControlFlowTok">
     <w:name w:val="ControlFlowTok"/>
     <w:basedOn w:val="VerbatimChar"/>
     <w:rPr>
-      <w:color w:val="007020"/>
+      <w:color w:val="204a87"/>
+      <w:shd w:val="clear" w:fill="f8f8f8"/>
       <w:b/>
     </w:rPr>
   </w:style>
@@ -17173,45 +17179,55 @@
     <w:name w:val="OperatorTok"/>
     <w:basedOn w:val="VerbatimChar"/>
     <w:rPr>
-      <w:color w:val="666666"/>
+      <w:color w:val="ce5c00"/>
+      <w:shd w:val="clear" w:fill="f8f8f8"/>
+      <w:b/>
     </w:rPr>
   </w:style>
   <w:style w:type="character" w:customStyle="1" w:styleId="BuiltInTok">
     <w:name w:val="BuiltInTok"/>
     <w:basedOn w:val="VerbatimChar"/>
     <w:rPr>
-      <w:color w:val="008000"/>
+      <w:shd w:val="clear" w:fill="f8f8f8"/>
     </w:rPr>
   </w:style>
   <w:style w:type="character" w:customStyle="1" w:styleId="ExtensionTok">
     <w:name w:val="ExtensionTok"/>
     <w:basedOn w:val="VerbatimChar"/>
-    <w:rPr/>
+    <w:rPr>
+      <w:shd w:val="clear" w:fill="f8f8f8"/>
+    </w:rPr>
   </w:style>
   <w:style w:type="character" w:customStyle="1" w:styleId="PreprocessorTok">
     <w:name w:val="PreprocessorTok"/>
     <w:basedOn w:val="VerbatimChar"/>
     <w:rPr>
-      <w:color w:val="bc7a00"/>
+      <w:color w:val="8f5902"/>
+      <w:shd w:val="clear" w:fill="f8f8f8"/>
+      <w:i/>
     </w:rPr>
   </w:style>
   <w:style w:type="character" w:customStyle="1" w:styleId="AttributeTok">
     <w:name w:val="AttributeTok"/>
     <w:basedOn w:val="VerbatimChar"/>
     <w:rPr>
-      <w:color w:val="7d9029"/>
+      <w:color w:val="204a87"/>
+      <w:shd w:val="clear" w:fill="f8f8f8"/>
     </w:rPr>
   </w:style>
   <w:style w:type="character" w:customStyle="1" w:styleId="RegionMarkerTok">
     <w:name w:val="RegionMarkerTok"/>
     <w:basedOn w:val="VerbatimChar"/>
-    <w:rPr/>
+    <w:rPr>
+      <w:shd w:val="clear" w:fill="f8f8f8"/>
+    </w:rPr>
   </w:style>
   <w:style w:type="character" w:customStyle="1" w:styleId="InformationTok">
     <w:name w:val="InformationTok"/>
     <w:basedOn w:val="VerbatimChar"/>
     <w:rPr>
-      <w:color w:val="60a0b0"/>
+      <w:color w:val="8f5902"/>
+      <w:shd w:val="clear" w:fill="f8f8f8"/>
       <w:b/>
       <w:i/>
     </w:rPr>
@@ -17220,7 +17236,8 @@
     <w:name w:val="WarningTok"/>
     <w:basedOn w:val="VerbatimChar"/>
     <w:rPr>
-      <w:color w:val="60a0b0"/>
+      <w:color w:val="8f5902"/>
+      <w:shd w:val="clear" w:fill="f8f8f8"/>
       <w:b/>
       <w:i/>
     </w:rPr>
@@ -17229,22 +17246,25 @@
     <w:name w:val="AlertTok"/>
     <w:basedOn w:val="VerbatimChar"/>
     <w:rPr>
-      <w:color w:val="ff0000"/>
-      <w:b/>
+      <w:color w:val="ef2929"/>
+      <w:shd w:val="clear" w:fill="f8f8f8"/>
     </w:rPr>
   </w:style>
   <w:style w:type="character" w:customStyle="1" w:styleId="ErrorTok">
     <w:name w:val="ErrorTok"/>
     <w:basedOn w:val="VerbatimChar"/>
     <w:rPr>
-      <w:color w:val="ff0000"/>
+      <w:color w:val="a40000"/>
+      <w:shd w:val="clear" w:fill="f8f8f8"/>
       <w:b/>
     </w:rPr>
   </w:style>
   <w:style w:type="character" w:customStyle="1" w:styleId="NormalTok">
     <w:name w:val="NormalTok"/>
     <w:basedOn w:val="VerbatimChar"/>
-    <w:rPr/>
+    <w:rPr>
+      <w:shd w:val="clear" w:fill="f8f8f8"/>
+    </w:rPr>
   </w:style>
 </w:styles>
 </file>

</xml_diff>